<commit_message>
feat: add support contact info and update tenant data
- Add 24/7 support contact information to login/auth modals
- Update tenant configuration and cleanup legacy records
- Improve tenant filtering logic for classes and attendance records
</commit_message>
<xml_diff>
--- a/Huong_Dan_Su_Dung_EduTutor_Pro.docx
+++ b/Huong_Dan_Su_Dung_EduTutor_Pro.docx
@@ -1278,7 +1278,7 @@
       <w:r>
         <w:drawing>
           <wp:inline distT="0" distB="0" distL="0" distR="0">
-            <wp:extent cx="5238750" cy="3048000"/>
+            <wp:extent cx="4762500" cy="2762250"/>
             <wp:effectExtent t="0" r="0" b="0" l="0"/>
             <wp:docPr id="1" name="" descr="" title=""/>
             <wp:cNvGraphicFramePr>
@@ -1303,7 +1303,7 @@
                   <pic:spPr bwMode="auto">
                     <a:xfrm>
                       <a:off x="0" y="0"/>
-                      <a:ext cx="5238750" cy="3048000"/>
+                      <a:ext cx="4762500" cy="2762250"/>
                     </a:xfrm>
                     <a:prstGeom prst="rect">
                       <a:avLst/>
@@ -1606,7 +1606,7 @@
       <w:r>
         <w:drawing>
           <wp:inline distT="0" distB="0" distL="0" distR="0">
-            <wp:extent cx="5238750" cy="3048000"/>
+            <wp:extent cx="4762500" cy="2762250"/>
             <wp:effectExtent t="0" r="0" b="0" l="0"/>
             <wp:docPr id="2" name="" descr="" title=""/>
             <wp:cNvGraphicFramePr>
@@ -1631,7 +1631,7 @@
                   <pic:spPr bwMode="auto">
                     <a:xfrm>
                       <a:off x="0" y="0"/>
-                      <a:ext cx="5238750" cy="3048000"/>
+                      <a:ext cx="4762500" cy="2762250"/>
                     </a:xfrm>
                     <a:prstGeom prst="rect">
                       <a:avLst/>
@@ -1839,7 +1839,7 @@
       <w:r>
         <w:drawing>
           <wp:inline distT="0" distB="0" distL="0" distR="0">
-            <wp:extent cx="5238750" cy="3048000"/>
+            <wp:extent cx="4762500" cy="2762250"/>
             <wp:effectExtent t="0" r="0" b="0" l="0"/>
             <wp:docPr id="3" name="" descr="" title=""/>
             <wp:cNvGraphicFramePr>
@@ -1864,7 +1864,7 @@
                   <pic:spPr bwMode="auto">
                     <a:xfrm>
                       <a:off x="0" y="0"/>
-                      <a:ext cx="5238750" cy="3048000"/>
+                      <a:ext cx="4762500" cy="2762250"/>
                     </a:xfrm>
                     <a:prstGeom prst="rect">
                       <a:avLst/>
@@ -2069,7 +2069,7 @@
       <w:r>
         <w:drawing>
           <wp:inline distT="0" distB="0" distL="0" distR="0">
-            <wp:extent cx="5238750" cy="3048000"/>
+            <wp:extent cx="4762500" cy="2762250"/>
             <wp:effectExtent t="0" r="0" b="0" l="0"/>
             <wp:docPr id="4" name="" descr="" title=""/>
             <wp:cNvGraphicFramePr>
@@ -2094,7 +2094,7 @@
                   <pic:spPr bwMode="auto">
                     <a:xfrm>
                       <a:off x="0" y="0"/>
-                      <a:ext cx="5238750" cy="3048000"/>
+                      <a:ext cx="4762500" cy="2762250"/>
                     </a:xfrm>
                     <a:prstGeom prst="rect">
                       <a:avLst/>
@@ -2269,7 +2269,7 @@
       <w:r>
         <w:drawing>
           <wp:inline distT="0" distB="0" distL="0" distR="0">
-            <wp:extent cx="5238750" cy="3048000"/>
+            <wp:extent cx="4762500" cy="2762250"/>
             <wp:effectExtent t="0" r="0" b="0" l="0"/>
             <wp:docPr id="5" name="" descr="" title=""/>
             <wp:cNvGraphicFramePr>
@@ -2294,7 +2294,7 @@
                   <pic:spPr bwMode="auto">
                     <a:xfrm>
                       <a:off x="0" y="0"/>
-                      <a:ext cx="5238750" cy="3048000"/>
+                      <a:ext cx="4762500" cy="2762250"/>
                     </a:xfrm>
                     <a:prstGeom prst="rect">
                       <a:avLst/>
@@ -2523,7 +2523,7 @@
       <w:r>
         <w:drawing>
           <wp:inline distT="0" distB="0" distL="0" distR="0">
-            <wp:extent cx="5238750" cy="3048000"/>
+            <wp:extent cx="4762500" cy="2762250"/>
             <wp:effectExtent t="0" r="0" b="0" l="0"/>
             <wp:docPr id="6" name="" descr="" title=""/>
             <wp:cNvGraphicFramePr>
@@ -2548,7 +2548,7 @@
                   <pic:spPr bwMode="auto">
                     <a:xfrm>
                       <a:off x="0" y="0"/>
-                      <a:ext cx="5238750" cy="3048000"/>
+                      <a:ext cx="4762500" cy="2762250"/>
                     </a:xfrm>
                     <a:prstGeom prst="rect">
                       <a:avLst/>
@@ -2693,7 +2693,7 @@
       <w:r>
         <w:drawing>
           <wp:inline distT="0" distB="0" distL="0" distR="0">
-            <wp:extent cx="5238750" cy="3048000"/>
+            <wp:extent cx="4762500" cy="2762250"/>
             <wp:effectExtent t="0" r="0" b="0" l="0"/>
             <wp:docPr id="7" name="" descr="" title=""/>
             <wp:cNvGraphicFramePr>
@@ -2718,7 +2718,7 @@
                   <pic:spPr bwMode="auto">
                     <a:xfrm>
                       <a:off x="0" y="0"/>
-                      <a:ext cx="5238750" cy="3048000"/>
+                      <a:ext cx="4762500" cy="2762250"/>
                     </a:xfrm>
                     <a:prstGeom prst="rect">
                       <a:avLst/>
@@ -2951,7 +2951,7 @@
       <w:r>
         <w:drawing>
           <wp:inline distT="0" distB="0" distL="0" distR="0">
-            <wp:extent cx="5238750" cy="3048000"/>
+            <wp:extent cx="4762500" cy="2762250"/>
             <wp:effectExtent t="0" r="0" b="0" l="0"/>
             <wp:docPr id="8" name="" descr="" title=""/>
             <wp:cNvGraphicFramePr>
@@ -2976,7 +2976,7 @@
                   <pic:spPr bwMode="auto">
                     <a:xfrm>
                       <a:off x="0" y="0"/>
-                      <a:ext cx="5238750" cy="3048000"/>
+                      <a:ext cx="4762500" cy="2762250"/>
                     </a:xfrm>
                     <a:prstGeom prst="rect">
                       <a:avLst/>
@@ -3275,7 +3275,7 @@
       <w:r>
         <w:drawing>
           <wp:inline distT="0" distB="0" distL="0" distR="0">
-            <wp:extent cx="5238750" cy="3048000"/>
+            <wp:extent cx="4762500" cy="2762250"/>
             <wp:effectExtent t="0" r="0" b="0" l="0"/>
             <wp:docPr id="9" name="" descr="" title=""/>
             <wp:cNvGraphicFramePr>
@@ -3300,7 +3300,7 @@
                   <pic:spPr bwMode="auto">
                     <a:xfrm>
                       <a:off x="0" y="0"/>
-                      <a:ext cx="5238750" cy="3048000"/>
+                      <a:ext cx="4762500" cy="2762250"/>
                     </a:xfrm>
                     <a:prstGeom prst="rect">
                       <a:avLst/>
@@ -3724,7 +3724,7 @@
       <w:r>
         <w:drawing>
           <wp:inline distT="0" distB="0" distL="0" distR="0">
-            <wp:extent cx="5238750" cy="3048000"/>
+            <wp:extent cx="4762500" cy="2762250"/>
             <wp:effectExtent t="0" r="0" b="0" l="0"/>
             <wp:docPr id="10" name="" descr="" title=""/>
             <wp:cNvGraphicFramePr>
@@ -3749,7 +3749,7 @@
                   <pic:spPr bwMode="auto">
                     <a:xfrm>
                       <a:off x="0" y="0"/>
-                      <a:ext cx="5238750" cy="3048000"/>
+                      <a:ext cx="4762500" cy="2762250"/>
                     </a:xfrm>
                     <a:prstGeom prst="rect">
                       <a:avLst/>
@@ -3927,7 +3927,7 @@
       <w:r>
         <w:drawing>
           <wp:inline distT="0" distB="0" distL="0" distR="0">
-            <wp:extent cx="5238750" cy="3048000"/>
+            <wp:extent cx="4762500" cy="2762250"/>
             <wp:effectExtent t="0" r="0" b="0" l="0"/>
             <wp:docPr id="11" name="" descr="" title=""/>
             <wp:cNvGraphicFramePr>
@@ -3952,7 +3952,7 @@
                   <pic:spPr bwMode="auto">
                     <a:xfrm>
                       <a:off x="0" y="0"/>
-                      <a:ext cx="5238750" cy="3048000"/>
+                      <a:ext cx="4762500" cy="2762250"/>
                     </a:xfrm>
                     <a:prstGeom prst="rect">
                       <a:avLst/>
@@ -4157,7 +4157,7 @@
       <w:r>
         <w:drawing>
           <wp:inline distT="0" distB="0" distL="0" distR="0">
-            <wp:extent cx="5238750" cy="3048000"/>
+            <wp:extent cx="4762500" cy="2762250"/>
             <wp:effectExtent t="0" r="0" b="0" l="0"/>
             <wp:docPr id="12" name="" descr="" title=""/>
             <wp:cNvGraphicFramePr>
@@ -4182,7 +4182,7 @@
                   <pic:spPr bwMode="auto">
                     <a:xfrm>
                       <a:off x="0" y="0"/>
-                      <a:ext cx="5238750" cy="3048000"/>
+                      <a:ext cx="4762500" cy="2762250"/>
                     </a:xfrm>
                     <a:prstGeom prst="rect">
                       <a:avLst/>
@@ -4415,7 +4415,7 @@
       <w:r>
         <w:drawing>
           <wp:inline distT="0" distB="0" distL="0" distR="0">
-            <wp:extent cx="5238750" cy="3048000"/>
+            <wp:extent cx="4762500" cy="2762250"/>
             <wp:effectExtent t="0" r="0" b="0" l="0"/>
             <wp:docPr id="13" name="" descr="" title=""/>
             <wp:cNvGraphicFramePr>
@@ -4440,7 +4440,7 @@
                   <pic:spPr bwMode="auto">
                     <a:xfrm>
                       <a:off x="0" y="0"/>
-                      <a:ext cx="5238750" cy="3048000"/>
+                      <a:ext cx="4762500" cy="2762250"/>
                     </a:xfrm>
                     <a:prstGeom prst="rect">
                       <a:avLst/>
@@ -4558,7 +4558,7 @@
       <w:r>
         <w:drawing>
           <wp:inline distT="0" distB="0" distL="0" distR="0">
-            <wp:extent cx="5238750" cy="3048000"/>
+            <wp:extent cx="4762500" cy="2762250"/>
             <wp:effectExtent t="0" r="0" b="0" l="0"/>
             <wp:docPr id="14" name="" descr="" title=""/>
             <wp:cNvGraphicFramePr>
@@ -4583,7 +4583,7 @@
                   <pic:spPr bwMode="auto">
                     <a:xfrm>
                       <a:off x="0" y="0"/>
-                      <a:ext cx="5238750" cy="3048000"/>
+                      <a:ext cx="4762500" cy="2762250"/>
                     </a:xfrm>
                     <a:prstGeom prst="rect">
                       <a:avLst/>
@@ -4779,7 +4779,7 @@
       <w:r>
         <w:drawing>
           <wp:inline distT="0" distB="0" distL="0" distR="0">
-            <wp:extent cx="5238750" cy="3048000"/>
+            <wp:extent cx="4762500" cy="2762250"/>
             <wp:effectExtent t="0" r="0" b="0" l="0"/>
             <wp:docPr id="15" name="" descr="" title=""/>
             <wp:cNvGraphicFramePr>
@@ -4804,7 +4804,7 @@
                   <pic:spPr bwMode="auto">
                     <a:xfrm>
                       <a:off x="0" y="0"/>
-                      <a:ext cx="5238750" cy="3048000"/>
+                      <a:ext cx="4762500" cy="2762250"/>
                     </a:xfrm>
                     <a:prstGeom prst="rect">
                       <a:avLst/>
@@ -5042,7 +5042,7 @@
       <w:r>
         <w:drawing>
           <wp:inline distT="0" distB="0" distL="0" distR="0">
-            <wp:extent cx="5238750" cy="3048000"/>
+            <wp:extent cx="4762500" cy="2762250"/>
             <wp:effectExtent t="0" r="0" b="0" l="0"/>
             <wp:docPr id="16" name="" descr="" title=""/>
             <wp:cNvGraphicFramePr>
@@ -5067,7 +5067,7 @@
                   <pic:spPr bwMode="auto">
                     <a:xfrm>
                       <a:off x="0" y="0"/>
-                      <a:ext cx="5238750" cy="3048000"/>
+                      <a:ext cx="4762500" cy="2762250"/>
                     </a:xfrm>
                     <a:prstGeom prst="rect">
                       <a:avLst/>
@@ -5275,7 +5275,7 @@
       <w:r>
         <w:drawing>
           <wp:inline distT="0" distB="0" distL="0" distR="0">
-            <wp:extent cx="5238750" cy="3048000"/>
+            <wp:extent cx="4762500" cy="2762250"/>
             <wp:effectExtent t="0" r="0" b="0" l="0"/>
             <wp:docPr id="17" name="" descr="" title=""/>
             <wp:cNvGraphicFramePr>
@@ -5300,7 +5300,7 @@
                   <pic:spPr bwMode="auto">
                     <a:xfrm>
                       <a:off x="0" y="0"/>
-                      <a:ext cx="5238750" cy="3048000"/>
+                      <a:ext cx="4762500" cy="2762250"/>
                     </a:xfrm>
                     <a:prstGeom prst="rect">
                       <a:avLst/>
@@ -5475,7 +5475,7 @@
       <w:r>
         <w:drawing>
           <wp:inline distT="0" distB="0" distL="0" distR="0">
-            <wp:extent cx="5238750" cy="3048000"/>
+            <wp:extent cx="4762500" cy="2762250"/>
             <wp:effectExtent t="0" r="0" b="0" l="0"/>
             <wp:docPr id="18" name="" descr="" title=""/>
             <wp:cNvGraphicFramePr>
@@ -5500,7 +5500,7 @@
                   <pic:spPr bwMode="auto">
                     <a:xfrm>
                       <a:off x="0" y="0"/>
-                      <a:ext cx="5238750" cy="3048000"/>
+                      <a:ext cx="4762500" cy="2762250"/>
                     </a:xfrm>
                     <a:prstGeom prst="rect">
                       <a:avLst/>
@@ -5766,7 +5766,7 @@
       <w:r>
         <w:drawing>
           <wp:inline distT="0" distB="0" distL="0" distR="0">
-            <wp:extent cx="5238750" cy="3048000"/>
+            <wp:extent cx="4762500" cy="2762250"/>
             <wp:effectExtent t="0" r="0" b="0" l="0"/>
             <wp:docPr id="19" name="" descr="" title=""/>
             <wp:cNvGraphicFramePr>
@@ -5791,7 +5791,7 @@
                   <pic:spPr bwMode="auto">
                     <a:xfrm>
                       <a:off x="0" y="0"/>
-                      <a:ext cx="5238750" cy="3048000"/>
+                      <a:ext cx="4762500" cy="2762250"/>
                     </a:xfrm>
                     <a:prstGeom prst="rect">
                       <a:avLst/>
@@ -5996,7 +5996,7 @@
       <w:r>
         <w:drawing>
           <wp:inline distT="0" distB="0" distL="0" distR="0">
-            <wp:extent cx="5238750" cy="3048000"/>
+            <wp:extent cx="4762500" cy="2762250"/>
             <wp:effectExtent t="0" r="0" b="0" l="0"/>
             <wp:docPr id="20" name="" descr="" title=""/>
             <wp:cNvGraphicFramePr>
@@ -6021,7 +6021,7 @@
                   <pic:spPr bwMode="auto">
                     <a:xfrm>
                       <a:off x="0" y="0"/>
-                      <a:ext cx="5238750" cy="3048000"/>
+                      <a:ext cx="4762500" cy="2762250"/>
                     </a:xfrm>
                     <a:prstGeom prst="rect">
                       <a:avLst/>
@@ -6153,8 +6153,8 @@
                 <w:szCs w:val="20"/>
               </w:rPr>
               <w:t xml:space="preserve">Khi cần giải đáp thắc mắc hoặc yêu cầu bổ sung tính năng theo đặc thù trung tâm, vui lòng liên hệ:
-• Email hỗ trợ: support@edututor.vn / tuannmit09@uranustech.vn
-• Hotline kỹ thuật: 0988 888 999
+• SĐT / Zalo hỗ trợ: 0986.07.07.68
+• Email hỗ trợ: tuannmit09@gmail.com
 • Cổng thông tin trợ giúp: Mục trợ giúp trên thanh điều hướng ứng dụng EduTutor Pro.</w:t>
             </w:r>
           </w:p>

</xml_diff>